<commit_message>
Add Quicklauncher project and core elements diary
</commit_message>
<xml_diff>
--- a/SDS_learning_diary_template.docx
+++ b/SDS_learning_diary_template.docx
@@ -223,6 +223,8 @@
           <w:lang w:val="en-US"/>
         </w:rPr>
       </w:pPr>
+      <w:bookmarkStart w:id="0" w:name="_GoBack"/>
+      <w:bookmarkEnd w:id="0"/>
     </w:p>
     <w:p>
       <w:pPr>
@@ -288,8 +290,9 @@
         <w:pStyle w:val="15"/>
         <w:spacing w:after="160" w:line="276" w:lineRule="auto"/>
         <w:rPr>
-          <w:b/>
+          <w:b w:val="0"/>
           <w:bCs/>
+          <w:sz w:val="24"/>
           <w:lang w:val="en-US"/>
         </w:rPr>
       </w:pPr>
@@ -318,7 +321,31 @@
         <w:pStyle w:val="15"/>
         <w:spacing w:after="160" w:line="276" w:lineRule="auto"/>
         <w:rPr>
+          <w:b w:val="0"/>
+          <w:bCs/>
+          <w:sz w:val="24"/>
+          <w:lang w:val="en-US"/>
+        </w:rPr>
+      </w:pPr>
+      <w:r>
+        <w:rPr>
+          <w:rFonts w:hint="eastAsia"/>
+          <w:b w:val="0"/>
+          <w:bCs/>
+          <w:sz w:val="24"/>
+          <w:lang w:val="en-US"/>
+        </w:rPr>
+        <w:t>Introduction [Part 1].</w:t>
+      </w:r>
+    </w:p>
+    <w:p>
+      <w:pPr>
+        <w:pStyle w:val="15"/>
+        <w:spacing w:after="160" w:line="276" w:lineRule="auto"/>
+        <w:rPr>
           <w:rFonts w:hint="default"/>
+          <w:b w:val="0"/>
+          <w:sz w:val="24"/>
           <w:lang w:val="en-US"/>
         </w:rPr>
       </w:pPr>
@@ -348,62 +375,46 @@
         </w:rPr>
         <w:t>.</w:t>
       </w:r>
-      <w:bookmarkStart w:id="0" w:name="_GoBack"/>
-      <w:bookmarkEnd w:id="0"/>
     </w:p>
     <w:p>
       <w:pPr>
-        <w:rPr>
-          <w:lang w:val="en-US"/>
-        </w:rPr>
-      </w:pPr>
+        <w:pStyle w:val="15"/>
+        <w:spacing w:after="160" w:line="276" w:lineRule="auto"/>
+        <w:rPr>
+          <w:rFonts w:hint="default"/>
+          <w:b w:val="0"/>
+          <w:sz w:val="24"/>
+          <w:lang w:val="en-US"/>
+        </w:rPr>
+      </w:pPr>
+      <w:r>
+        <w:rPr>
+          <w:rFonts w:hint="default"/>
+          <w:b w:val="0"/>
+          <w:sz w:val="24"/>
+          <w:lang w:val="en-US"/>
+        </w:rPr>
+        <w:t>Core Elements [Part 2].</w:t>
+      </w:r>
     </w:p>
     <w:p>
       <w:pPr>
-        <w:rPr>
-          <w:lang w:val="en-US"/>
-        </w:rPr>
-      </w:pPr>
-    </w:p>
-    <w:p>
-      <w:pPr>
-        <w:rPr>
-          <w:lang w:val="en-US"/>
-        </w:rPr>
-      </w:pPr>
-    </w:p>
-    <w:p>
-      <w:pPr>
-        <w:rPr>
-          <w:lang w:val="en-US"/>
-        </w:rPr>
-      </w:pPr>
-    </w:p>
-    <w:p>
-      <w:pPr>
-        <w:pStyle w:val="28"/>
-        <w:spacing w:line="360" w:lineRule="auto"/>
-        <w:rPr>
-          <w:lang w:val="en-US"/>
-        </w:rPr>
-      </w:pPr>
-    </w:p>
-    <w:p>
-      <w:pPr>
-        <w:pStyle w:val="28"/>
-        <w:spacing w:line="360" w:lineRule="auto"/>
-        <w:rPr>
-          <w:lang w:val="en-US"/>
-        </w:rPr>
-      </w:pPr>
-    </w:p>
-    <w:p>
-      <w:pPr>
-        <w:pStyle w:val="15"/>
-        <w:rPr>
-          <w:lang w:val="en-US"/>
-        </w:rPr>
-      </w:pPr>
+        <w:spacing w:after="160" w:line="276" w:lineRule="auto"/>
+      </w:pPr>
+      <w:r>
+        <w:rPr>
+          <w:rFonts w:hint="eastAsia" w:eastAsia="宋体"/>
+          <w:sz w:val="24"/>
+          <w:lang w:val="en-US" w:eastAsia="zh-CN"/>
+        </w:rPr>
+        <w:t>T</w:t>
+      </w:r>
+      <w:r>
+        <w:rPr>
+          <w:sz w:val="24"/>
+        </w:rPr>
+        <w:t>his lesson helped me understand the core elements of Android development. I learned how Activities represent screens, how Intents move between screens or open other apps, and why services and receivers are useful in larger Android apps.</w:t>
+      </w:r>
     </w:p>
     <w:sectPr>
       <w:headerReference r:id="rId3" w:type="default"/>
@@ -1959,8 +1970,26 @@
 </file>
 
 <file path=customXml/item1.xml><?xml version="1.0" encoding="utf-8"?>
-<ct:contentTypeSchema xmlns:ct="http://schemas.microsoft.com/office/2006/metadata/contentType" xmlns:ma="http://schemas.microsoft.com/office/2006/metadata/properties/metaAttributes" ct:_="" ma:contentTypeVersion="1" ma:_="" ma:contentTypeName="Asiakirja" ma:contentTypeDescription="Luo uusi asiakirja." ma:contentTypeID="0x01010017418C401CCB2042A3A99A19F43F356D" ma:contentTypeScope="" ma:versionID="f4b075d3ca74a5dbaed73e767a156aa0">
-  <xsd:schema xmlns:ns1="http://schemas.microsoft.com/sharepoint/v3" xmlns:p="http://schemas.microsoft.com/office/2006/metadata/properties" xmlns:xsd="http://www.w3.org/2001/XMLSchema" ns1:_="" ma:fieldsID="4340a008e99365d80b71206bae222996" ma:root="true" targetNamespace="http://schemas.microsoft.com/office/2006/metadata/properties">
+<p:properties xmlns:p="http://schemas.microsoft.com/office/2006/metadata/properties" xmlns:pc="http://schemas.microsoft.com/office/infopath/2007/PartnerControls" xmlns:xsi="http://www.w3.org/2001/XMLSchema-instance">
+  <documentManagement>
+    <PublishingExpirationDate xmlns="http://schemas.microsoft.com/sharepoint/v3" xsi:nil="true"/>
+    <PublishingStartDate xmlns="http://schemas.microsoft.com/sharepoint/v3" xsi:nil="true"/>
+  </documentManagement>
+</p:properties>
+</file>
+
+<file path=customXml/item2.xml><?xml version="1.0" encoding="utf-8"?>
+<?mso-contentType ?>
+<FormTemplates xmlns="http://schemas.microsoft.com/sharepoint/v3/contenttype/forms">
+  <Display>DocumentLibraryForm</Display>
+  <Edit>DocumentLibraryForm</Edit>
+  <New>DocumentLibraryForm</New>
+</FormTemplates>
+</file>
+
+<file path=customXml/item3.xml><?xml version="1.0" encoding="utf-8"?>
+<ct:contentTypeSchema xmlns:ma="http://schemas.microsoft.com/office/2006/metadata/properties/metaAttributes" xmlns:ct="http://schemas.microsoft.com/office/2006/metadata/contentType" ma:contentTypeID="0x01010017418C401CCB2042A3A99A19F43F356D" ma:contentTypeVersion="1" ma:contentTypeDescription="Luo uusi asiakirja." ma:contentTypeName="Asiakirja" ma:contentTypeScope="" ma:versionID="f4b075d3ca74a5dbaed73e767a156aa0" ct:_="" ma:_="">
+  <xsd:schema xmlns:ns1="http://schemas.microsoft.com/sharepoint/v3" xmlns:p="http://schemas.microsoft.com/office/2006/metadata/properties" xmlns:xsd="http://www.w3.org/2001/XMLSchema" targetNamespace="http://schemas.microsoft.com/office/2006/metadata/properties" ma:fieldsID="4340a008e99365d80b71206bae222996" ma:root="true" ns1:_="">
     <xsd:import namespace="http://schemas.microsoft.com/sharepoint/v3"/>
     <xsd:element name="properties">
       <xsd:complexType>
@@ -1977,73 +2006,55 @@
       </xsd:complexType>
     </xsd:element>
   </xsd:schema>
-  <xsd:schema xmlns:dms="http://schemas.microsoft.com/office/2006/documentManagement/types" xmlns:xsd="http://www.w3.org/2001/XMLSchema" elementFormDefault="qualified" targetNamespace="http://schemas.microsoft.com/sharepoint/v3">
+  <xsd:schema xmlns:xsd="http://www.w3.org/2001/XMLSchema" xmlns:dms="http://schemas.microsoft.com/office/2006/documentManagement/types" targetNamespace="http://schemas.microsoft.com/sharepoint/v3" elementFormDefault="qualified">
     <xsd:import namespace="http://schemas.microsoft.com/office/2006/documentManagement/types"/>
-    <xsd:element ma:displayName="Ajoituksen alkamispäivämäärä" name="PublishingStartDate" ma:description="" ma:hidden="true" ma:internalName="PublishingStartDate" nillable="true" ma:index="8">
+    <xsd:element ma:displayName="Ajoituksen alkamispäivämäärä" ma:description="" ma:hidden="true" nillable="true" ma:internalName="PublishingStartDate" name="PublishingStartDate" ma:index="8">
       <xsd:simpleType>
         <xsd:restriction base="dms:Unknown"/>
       </xsd:simpleType>
     </xsd:element>
-    <xsd:element ma:displayName="Ajoituksen päättymispäivämäärä" name="PublishingExpirationDate" ma:description="" ma:hidden="true" ma:internalName="PublishingExpirationDate" nillable="true" ma:index="9">
+    <xsd:element ma:displayName="Ajoituksen päättymispäivämäärä" ma:description="" ma:hidden="true" nillable="true" ma:internalName="PublishingExpirationDate" name="PublishingExpirationDate" ma:index="9">
       <xsd:simpleType>
         <xsd:restriction base="dms:Unknown"/>
       </xsd:simpleType>
     </xsd:element>
   </xsd:schema>
-  <xsd:schema xmlns:dcterms="http://purl.org/dc/terms/" xmlns="http://schemas.openxmlformats.org/package/2006/metadata/core-properties" xmlns:xsd="http://www.w3.org/2001/XMLSchema" xmlns:odoc="http://schemas.microsoft.com/office/internal/2005/internalDocumentation" xmlns:xsi="http://www.w3.org/2001/XMLSchema-instance" xmlns:dc="http://purl.org/dc/elements/1.1/" blockDefault="#all" attributeFormDefault="unqualified" elementFormDefault="qualified" targetNamespace="http://schemas.openxmlformats.org/package/2006/metadata/core-properties">
+  <xsd:schema xmlns:odoc="http://schemas.microsoft.com/office/internal/2005/internalDocumentation" xmlns:dcterms="http://purl.org/dc/terms/" xmlns="http://schemas.openxmlformats.org/package/2006/metadata/core-properties" xmlns:xsd="http://www.w3.org/2001/XMLSchema" xmlns:dc="http://purl.org/dc/elements/1.1/" xmlns:xsi="http://www.w3.org/2001/XMLSchema-instance" blockDefault="#all" targetNamespace="http://schemas.openxmlformats.org/package/2006/metadata/core-properties" attributeFormDefault="unqualified" elementFormDefault="qualified">
     <xsd:import namespace="http://purl.org/dc/elements/1.1/" schemaLocation="http://dublincore.org/schemas/xmls/qdc/2003/04/02/dc.xsd"/>
     <xsd:import namespace="http://purl.org/dc/terms/" schemaLocation="http://dublincore.org/schemas/xmls/qdc/2003/04/02/dcterms.xsd"/>
-    <xsd:element name="coreProperties" type="CT_coreProperties"/>
+    <xsd:element type="CT_coreProperties" name="coreProperties"/>
     <xsd:complexType name="CT_coreProperties">
       <xsd:all>
-        <xsd:element maxOccurs="1" ref="dc:creator" minOccurs="0"/>
-        <xsd:element maxOccurs="1" ref="dcterms:created" minOccurs="0"/>
-        <xsd:element maxOccurs="1" ref="dc:identifier" minOccurs="0"/>
-        <xsd:element ma:displayName="Sisältölaji" name="contentType" ma:readOnly="true" type="xsd:string" maxOccurs="1" minOccurs="0" ma:index="0"/>
-        <xsd:element ma:displayName="Otsikko" maxOccurs="1" ref="dc:title" minOccurs="0" ma:index="4"/>
-        <xsd:element maxOccurs="1" ref="dc:subject" minOccurs="0"/>
-        <xsd:element maxOccurs="1" ref="dc:description" minOccurs="0"/>
-        <xsd:element name="keywords" type="xsd:string" maxOccurs="1" minOccurs="0"/>
-        <xsd:element maxOccurs="1" ref="dc:language" minOccurs="0"/>
-        <xsd:element name="category" type="xsd:string" maxOccurs="1" minOccurs="0"/>
-        <xsd:element name="version" type="xsd:string" maxOccurs="1" minOccurs="0"/>
-        <xsd:element name="revision" type="xsd:string" maxOccurs="1" minOccurs="0">
+        <xsd:element ref="dc:creator" maxOccurs="1" minOccurs="0"/>
+        <xsd:element ref="dcterms:created" maxOccurs="1" minOccurs="0"/>
+        <xsd:element ref="dc:identifier" maxOccurs="1" minOccurs="0"/>
+        <xsd:element ma:readOnly="true" ma:displayName="Sisältölaji" type="xsd:string" name="contentType" maxOccurs="1" ma:index="0" minOccurs="0"/>
+        <xsd:element ma:displayName="Otsikko" ref="dc:title" maxOccurs="1" ma:index="4" minOccurs="0"/>
+        <xsd:element ref="dc:subject" maxOccurs="1" minOccurs="0"/>
+        <xsd:element ref="dc:description" maxOccurs="1" minOccurs="0"/>
+        <xsd:element type="xsd:string" name="keywords" maxOccurs="1" minOccurs="0"/>
+        <xsd:element ref="dc:language" maxOccurs="1" minOccurs="0"/>
+        <xsd:element type="xsd:string" name="category" maxOccurs="1" minOccurs="0"/>
+        <xsd:element type="xsd:string" name="version" maxOccurs="1" minOccurs="0"/>
+        <xsd:element type="xsd:string" name="revision" maxOccurs="1" minOccurs="0">
           <xsd:annotation>
             <xsd:documentation>
                         This value indicates the number of saves or revisions. The application is responsible for updating this value after each revision.
                     </xsd:documentation>
           </xsd:annotation>
         </xsd:element>
-        <xsd:element name="lastModifiedBy" type="xsd:string" maxOccurs="1" minOccurs="0"/>
-        <xsd:element maxOccurs="1" ref="dcterms:modified" minOccurs="0"/>
-        <xsd:element name="lastPrinted" type="xsd:dateTime" maxOccurs="1" minOccurs="0"/>
-        <xsd:element name="contentStatus" type="xsd:string" maxOccurs="1" minOccurs="0"/>
+        <xsd:element type="xsd:string" name="lastModifiedBy" maxOccurs="1" minOccurs="0"/>
+        <xsd:element ref="dcterms:modified" maxOccurs="1" minOccurs="0"/>
+        <xsd:element type="xsd:dateTime" name="lastPrinted" maxOccurs="1" minOccurs="0"/>
+        <xsd:element type="xsd:string" name="contentStatus" maxOccurs="1" minOccurs="0"/>
       </xsd:all>
     </xsd:complexType>
   </xsd:schema>
 </ct:contentTypeSchema>
 </file>
 
-<file path=customXml/item2.xml><?xml version="1.0" encoding="utf-8"?>
-<?mso-contentType ?>
-<FormTemplates xmlns="http://schemas.microsoft.com/sharepoint/v3/contenttype/forms">
-  <Display>DocumentLibraryForm</Display>
-  <Edit>DocumentLibraryForm</Edit>
-  <New>DocumentLibraryForm</New>
-</FormTemplates>
-</file>
-
-<file path=customXml/item3.xml><?xml version="1.0" encoding="utf-8"?>
-<p:properties xmlns:p="http://schemas.microsoft.com/office/2006/metadata/properties" xmlns:pc="http://schemas.microsoft.com/office/infopath/2007/PartnerControls" xmlns:xsi="http://www.w3.org/2001/XMLSchema-instance">
-  <documentManagement>
-    <PublishingExpirationDate xmlns="http://schemas.microsoft.com/sharepoint/v3" xsi:nil="true"/>
-    <PublishingStartDate xmlns="http://schemas.microsoft.com/sharepoint/v3" xsi:nil="true"/>
-  </documentManagement>
-</p:properties>
-</file>
-
 <file path=customXml/itemProps1.xml><?xml version="1.0" encoding="utf-8"?>
-<ds:datastoreItem xmlns:ds="http://schemas.openxmlformats.org/officeDocument/2006/customXml" ds:itemID="{B9A87442-5A7B-46FD-BD28-170CE9B7256F}">
+<ds:datastoreItem xmlns:ds="http://schemas.openxmlformats.org/officeDocument/2006/customXml" ds:itemID="{FA8F0064-303C-446D-896E-46EEB9A79DC3}">
   <ds:schemaRefs/>
 </ds:datastoreItem>
 </file>
@@ -2055,7 +2066,7 @@
 </file>
 
 <file path=customXml/itemProps3.xml><?xml version="1.0" encoding="utf-8"?>
-<ds:datastoreItem xmlns:ds="http://schemas.openxmlformats.org/officeDocument/2006/customXml" ds:itemID="{FA8F0064-303C-446D-896E-46EEB9A79DC3}">
+<ds:datastoreItem xmlns:ds="http://schemas.openxmlformats.org/officeDocument/2006/customXml" ds:itemID="{B9A87442-5A7B-46FD-BD28-170CE9B7256F}">
   <ds:schemaRefs/>
 </ds:datastoreItem>
 </file>
</xml_diff>

<commit_message>
Add ListApp project and lists diary
</commit_message>
<xml_diff>
--- a/SDS_learning_diary_template.docx
+++ b/SDS_learning_diary_template.docx
@@ -153,6 +153,8 @@
           <w:lang w:val="en-US"/>
         </w:rPr>
       </w:pPr>
+      <w:bookmarkStart w:id="0" w:name="_GoBack"/>
+      <w:bookmarkEnd w:id="0"/>
     </w:p>
     <w:p>
       <w:pPr>
@@ -223,8 +225,6 @@
           <w:lang w:val="en-US"/>
         </w:rPr>
       </w:pPr>
-      <w:bookmarkStart w:id="0" w:name="_GoBack"/>
-      <w:bookmarkEnd w:id="0"/>
     </w:p>
     <w:p>
       <w:pPr>
@@ -400,6 +400,9 @@
     <w:p>
       <w:pPr>
         <w:spacing w:after="160" w:line="276" w:lineRule="auto"/>
+        <w:rPr>
+          <w:sz w:val="24"/>
+        </w:rPr>
       </w:pPr>
       <w:r>
         <w:rPr>
@@ -415,6 +418,118 @@
         </w:rPr>
         <w:t>his lesson helped me understand the core elements of Android development. I learned how Activities represent screens, how Intents move between screens or open other apps, and why services and receivers are useful in larger Android apps.</w:t>
       </w:r>
+    </w:p>
+    <w:p>
+      <w:pPr>
+        <w:spacing w:after="160" w:line="276" w:lineRule="auto"/>
+        <w:rPr>
+          <w:sz w:val="24"/>
+        </w:rPr>
+      </w:pPr>
+    </w:p>
+    <w:p>
+      <w:pPr>
+        <w:spacing w:after="160" w:line="276" w:lineRule="auto"/>
+        <w:rPr>
+          <w:rFonts w:hint="eastAsia"/>
+          <w:sz w:val="24"/>
+        </w:rPr>
+      </w:pPr>
+      <w:r>
+        <w:rPr>
+          <w:rFonts w:hint="eastAsia"/>
+          <w:sz w:val="24"/>
+        </w:rPr>
+        <w:t>1.5.2026</w:t>
+      </w:r>
+    </w:p>
+    <w:p>
+      <w:pPr>
+        <w:spacing w:after="160" w:line="276" w:lineRule="auto"/>
+        <w:rPr>
+          <w:rFonts w:hint="eastAsia"/>
+          <w:sz w:val="24"/>
+        </w:rPr>
+      </w:pPr>
+      <w:r>
+        <w:rPr>
+          <w:rFonts w:hint="eastAsia"/>
+          <w:sz w:val="24"/>
+        </w:rPr>
+        <w:t>Lists, Layouts, and Images [Part 3].</w:t>
+      </w:r>
+    </w:p>
+    <w:p>
+      <w:pPr>
+        <w:spacing w:after="160" w:line="276" w:lineRule="auto"/>
+        <w:rPr>
+          <w:rFonts w:hint="eastAsia"/>
+          <w:sz w:val="24"/>
+        </w:rPr>
+      </w:pPr>
+      <w:r>
+        <w:rPr>
+          <w:rFonts w:hint="eastAsia"/>
+          <w:sz w:val="24"/>
+        </w:rPr>
+        <w:t>Today I watched Lists, Layouts, and Images Part 3 and opened the ListApp project in Android Studio. First, I checked the main files, including MainActivity.java, ItemAdapter.java, DetailActivity.java, activity_main.xml, my_listview_detail.xml, activity_detail.xml, and strings.xml.</w:t>
+      </w:r>
+    </w:p>
+    <w:p>
+      <w:pPr>
+        <w:spacing w:after="160" w:line="276" w:lineRule="auto"/>
+        <w:rPr>
+          <w:rFonts w:hint="eastAsia"/>
+          <w:sz w:val="24"/>
+        </w:rPr>
+      </w:pPr>
+      <w:r>
+        <w:rPr>
+          <w:rFonts w:hint="eastAsia"/>
+          <w:sz w:val="24"/>
+        </w:rPr>
+        <w:t>I learned how to use a ListView to show several items on the screen. In this project, the app gets item names, prices, and descriptions from string arrays, then uses a custom ItemAdapter to put the data into the list.</w:t>
+      </w:r>
+    </w:p>
+    <w:p>
+      <w:pPr>
+        <w:spacing w:after="160" w:line="276" w:lineRule="auto"/>
+        <w:rPr>
+          <w:rFonts w:hint="eastAsia"/>
+          <w:sz w:val="24"/>
+        </w:rPr>
+      </w:pPr>
+      <w:r>
+        <w:rPr>
+          <w:rFonts w:hint="eastAsia"/>
+          <w:sz w:val="24"/>
+        </w:rPr>
+        <w:t>I also learned how to create a custom list layout. The file my_listview_detail.xml controls how each row looks, with TextViews for the item name, description, and price. This helped me understand that each list row can have its own design, not just simple text.</w:t>
+      </w:r>
+    </w:p>
+    <w:p>
+      <w:pPr>
+        <w:spacing w:after="160" w:line="276" w:lineRule="auto"/>
+        <w:rPr>
+          <w:rFonts w:hint="eastAsia"/>
+          <w:sz w:val="24"/>
+        </w:rPr>
+      </w:pPr>
+      <w:r>
+        <w:rPr>
+          <w:rFonts w:hint="eastAsia"/>
+          <w:sz w:val="24"/>
+        </w:rPr>
+        <w:t>Finally, I looked at how images are used with ImageView. When I click a list item, the app opens DetailActivity and shows the correct image, such as peach, tomato, or squash. This lesson helped me understand how lists, custom layouts, intents, and images work together in a simple Android app.</w:t>
+      </w:r>
+    </w:p>
+    <w:p>
+      <w:pPr>
+        <w:spacing w:after="160" w:line="276" w:lineRule="auto"/>
+        <w:rPr>
+          <w:sz w:val="24"/>
+        </w:rPr>
+      </w:pPr>
     </w:p>
     <w:sectPr>
       <w:headerReference r:id="rId3" w:type="default"/>
@@ -1970,12 +2085,69 @@
 </file>
 
 <file path=customXml/item1.xml><?xml version="1.0" encoding="utf-8"?>
-<p:properties xmlns:p="http://schemas.microsoft.com/office/2006/metadata/properties" xmlns:pc="http://schemas.microsoft.com/office/infopath/2007/PartnerControls" xmlns:xsi="http://www.w3.org/2001/XMLSchema-instance">
-  <documentManagement>
-    <PublishingExpirationDate xmlns="http://schemas.microsoft.com/sharepoint/v3" xsi:nil="true"/>
-    <PublishingStartDate xmlns="http://schemas.microsoft.com/sharepoint/v3" xsi:nil="true"/>
-  </documentManagement>
-</p:properties>
+<ct:contentTypeSchema xmlns:ct="http://schemas.microsoft.com/office/2006/metadata/contentType" xmlns:ma="http://schemas.microsoft.com/office/2006/metadata/properties/metaAttributes" ma:contentTypeVersion="1" ma:contentTypeScope="" ct:_="" ma:_="" ma:contentTypeID="0x01010017418C401CCB2042A3A99A19F43F356D" ma:contentTypeName="Asiakirja" ma:contentTypeDescription="Luo uusi asiakirja." ma:versionID="f4b075d3ca74a5dbaed73e767a156aa0">
+  <xsd:schema xmlns:p="http://schemas.microsoft.com/office/2006/metadata/properties" xmlns:ns1="http://schemas.microsoft.com/sharepoint/v3" xmlns:xsd="http://www.w3.org/2001/XMLSchema" ns1:_="" ma:root="true" targetNamespace="http://schemas.microsoft.com/office/2006/metadata/properties" ma:fieldsID="4340a008e99365d80b71206bae222996">
+    <xsd:import namespace="http://schemas.microsoft.com/sharepoint/v3"/>
+    <xsd:element name="properties">
+      <xsd:complexType>
+        <xsd:sequence>
+          <xsd:element name="documentManagement">
+            <xsd:complexType>
+              <xsd:all>
+                <xsd:element minOccurs="0" ref="ns1:PublishingStartDate"/>
+                <xsd:element minOccurs="0" ref="ns1:PublishingExpirationDate"/>
+              </xsd:all>
+            </xsd:complexType>
+          </xsd:element>
+        </xsd:sequence>
+      </xsd:complexType>
+    </xsd:element>
+  </xsd:schema>
+  <xsd:schema xmlns:dms="http://schemas.microsoft.com/office/2006/documentManagement/types" xmlns:xsd="http://www.w3.org/2001/XMLSchema" targetNamespace="http://schemas.microsoft.com/sharepoint/v3" elementFormDefault="qualified">
+    <xsd:import namespace="http://schemas.microsoft.com/office/2006/documentManagement/types"/>
+    <xsd:element ma:internalName="PublishingStartDate" name="PublishingStartDate" nillable="true" ma:displayName="Ajoituksen alkamispäivämäärä" ma:hidden="true" ma:index="8" ma:description="">
+      <xsd:simpleType>
+        <xsd:restriction base="dms:Unknown"/>
+      </xsd:simpleType>
+    </xsd:element>
+    <xsd:element ma:internalName="PublishingExpirationDate" name="PublishingExpirationDate" nillable="true" ma:displayName="Ajoituksen päättymispäivämäärä" ma:hidden="true" ma:index="9" ma:description="">
+      <xsd:simpleType>
+        <xsd:restriction base="dms:Unknown"/>
+      </xsd:simpleType>
+    </xsd:element>
+  </xsd:schema>
+  <xsd:schema xmlns:dcterms="http://purl.org/dc/terms/" xmlns:xsi="http://www.w3.org/2001/XMLSchema-instance" xmlns="http://schemas.openxmlformats.org/package/2006/metadata/core-properties" xmlns:odoc="http://schemas.microsoft.com/office/internal/2005/internalDocumentation" xmlns:dc="http://purl.org/dc/elements/1.1/" xmlns:xsd="http://www.w3.org/2001/XMLSchema" blockDefault="#all" attributeFormDefault="unqualified" targetNamespace="http://schemas.openxmlformats.org/package/2006/metadata/core-properties" elementFormDefault="qualified">
+    <xsd:import schemaLocation="http://dublincore.org/schemas/xmls/qdc/2003/04/02/dc.xsd" namespace="http://purl.org/dc/elements/1.1/"/>
+    <xsd:import schemaLocation="http://dublincore.org/schemas/xmls/qdc/2003/04/02/dcterms.xsd" namespace="http://purl.org/dc/terms/"/>
+    <xsd:element name="coreProperties" type="CT_coreProperties"/>
+    <xsd:complexType name="CT_coreProperties">
+      <xsd:all>
+        <xsd:element minOccurs="0" ref="dc:creator" maxOccurs="1"/>
+        <xsd:element minOccurs="0" ref="dcterms:created" maxOccurs="1"/>
+        <xsd:element minOccurs="0" ref="dc:identifier" maxOccurs="1"/>
+        <xsd:element minOccurs="0" name="contentType" ma:readOnly="true" ma:displayName="Sisältölaji" ma:index="0" type="xsd:string" maxOccurs="1"/>
+        <xsd:element minOccurs="0" ref="dc:title" ma:displayName="Otsikko" ma:index="4" maxOccurs="1"/>
+        <xsd:element minOccurs="0" ref="dc:subject" maxOccurs="1"/>
+        <xsd:element minOccurs="0" ref="dc:description" maxOccurs="1"/>
+        <xsd:element minOccurs="0" name="keywords" type="xsd:string" maxOccurs="1"/>
+        <xsd:element minOccurs="0" ref="dc:language" maxOccurs="1"/>
+        <xsd:element minOccurs="0" name="category" type="xsd:string" maxOccurs="1"/>
+        <xsd:element minOccurs="0" name="version" type="xsd:string" maxOccurs="1"/>
+        <xsd:element minOccurs="0" name="revision" type="xsd:string" maxOccurs="1">
+          <xsd:annotation>
+            <xsd:documentation>
+                        This value indicates the number of saves or revisions. The application is responsible for updating this value after each revision.
+                    </xsd:documentation>
+          </xsd:annotation>
+        </xsd:element>
+        <xsd:element minOccurs="0" name="lastModifiedBy" type="xsd:string" maxOccurs="1"/>
+        <xsd:element minOccurs="0" ref="dcterms:modified" maxOccurs="1"/>
+        <xsd:element minOccurs="0" name="lastPrinted" type="xsd:dateTime" maxOccurs="1"/>
+        <xsd:element minOccurs="0" name="contentStatus" type="xsd:string" maxOccurs="1"/>
+      </xsd:all>
+    </xsd:complexType>
+  </xsd:schema>
+</ct:contentTypeSchema>
 </file>
 
 <file path=customXml/item2.xml><?xml version="1.0" encoding="utf-8"?>
@@ -1988,73 +2160,16 @@
 </file>
 
 <file path=customXml/item3.xml><?xml version="1.0" encoding="utf-8"?>
-<ct:contentTypeSchema xmlns:ma="http://schemas.microsoft.com/office/2006/metadata/properties/metaAttributes" xmlns:ct="http://schemas.microsoft.com/office/2006/metadata/contentType" ma:contentTypeID="0x01010017418C401CCB2042A3A99A19F43F356D" ma:contentTypeVersion="1" ma:contentTypeDescription="Luo uusi asiakirja." ma:contentTypeName="Asiakirja" ma:contentTypeScope="" ma:versionID="f4b075d3ca74a5dbaed73e767a156aa0" ct:_="" ma:_="">
-  <xsd:schema xmlns:ns1="http://schemas.microsoft.com/sharepoint/v3" xmlns:p="http://schemas.microsoft.com/office/2006/metadata/properties" xmlns:xsd="http://www.w3.org/2001/XMLSchema" targetNamespace="http://schemas.microsoft.com/office/2006/metadata/properties" ma:fieldsID="4340a008e99365d80b71206bae222996" ma:root="true" ns1:_="">
-    <xsd:import namespace="http://schemas.microsoft.com/sharepoint/v3"/>
-    <xsd:element name="properties">
-      <xsd:complexType>
-        <xsd:sequence>
-          <xsd:element name="documentManagement">
-            <xsd:complexType>
-              <xsd:all>
-                <xsd:element ref="ns1:PublishingStartDate" minOccurs="0"/>
-                <xsd:element ref="ns1:PublishingExpirationDate" minOccurs="0"/>
-              </xsd:all>
-            </xsd:complexType>
-          </xsd:element>
-        </xsd:sequence>
-      </xsd:complexType>
-    </xsd:element>
-  </xsd:schema>
-  <xsd:schema xmlns:xsd="http://www.w3.org/2001/XMLSchema" xmlns:dms="http://schemas.microsoft.com/office/2006/documentManagement/types" targetNamespace="http://schemas.microsoft.com/sharepoint/v3" elementFormDefault="qualified">
-    <xsd:import namespace="http://schemas.microsoft.com/office/2006/documentManagement/types"/>
-    <xsd:element ma:displayName="Ajoituksen alkamispäivämäärä" ma:description="" ma:hidden="true" nillable="true" ma:internalName="PublishingStartDate" name="PublishingStartDate" ma:index="8">
-      <xsd:simpleType>
-        <xsd:restriction base="dms:Unknown"/>
-      </xsd:simpleType>
-    </xsd:element>
-    <xsd:element ma:displayName="Ajoituksen päättymispäivämäärä" ma:description="" ma:hidden="true" nillable="true" ma:internalName="PublishingExpirationDate" name="PublishingExpirationDate" ma:index="9">
-      <xsd:simpleType>
-        <xsd:restriction base="dms:Unknown"/>
-      </xsd:simpleType>
-    </xsd:element>
-  </xsd:schema>
-  <xsd:schema xmlns:odoc="http://schemas.microsoft.com/office/internal/2005/internalDocumentation" xmlns:dcterms="http://purl.org/dc/terms/" xmlns="http://schemas.openxmlformats.org/package/2006/metadata/core-properties" xmlns:xsd="http://www.w3.org/2001/XMLSchema" xmlns:dc="http://purl.org/dc/elements/1.1/" xmlns:xsi="http://www.w3.org/2001/XMLSchema-instance" blockDefault="#all" targetNamespace="http://schemas.openxmlformats.org/package/2006/metadata/core-properties" attributeFormDefault="unqualified" elementFormDefault="qualified">
-    <xsd:import namespace="http://purl.org/dc/elements/1.1/" schemaLocation="http://dublincore.org/schemas/xmls/qdc/2003/04/02/dc.xsd"/>
-    <xsd:import namespace="http://purl.org/dc/terms/" schemaLocation="http://dublincore.org/schemas/xmls/qdc/2003/04/02/dcterms.xsd"/>
-    <xsd:element type="CT_coreProperties" name="coreProperties"/>
-    <xsd:complexType name="CT_coreProperties">
-      <xsd:all>
-        <xsd:element ref="dc:creator" maxOccurs="1" minOccurs="0"/>
-        <xsd:element ref="dcterms:created" maxOccurs="1" minOccurs="0"/>
-        <xsd:element ref="dc:identifier" maxOccurs="1" minOccurs="0"/>
-        <xsd:element ma:readOnly="true" ma:displayName="Sisältölaji" type="xsd:string" name="contentType" maxOccurs="1" ma:index="0" minOccurs="0"/>
-        <xsd:element ma:displayName="Otsikko" ref="dc:title" maxOccurs="1" ma:index="4" minOccurs="0"/>
-        <xsd:element ref="dc:subject" maxOccurs="1" minOccurs="0"/>
-        <xsd:element ref="dc:description" maxOccurs="1" minOccurs="0"/>
-        <xsd:element type="xsd:string" name="keywords" maxOccurs="1" minOccurs="0"/>
-        <xsd:element ref="dc:language" maxOccurs="1" minOccurs="0"/>
-        <xsd:element type="xsd:string" name="category" maxOccurs="1" minOccurs="0"/>
-        <xsd:element type="xsd:string" name="version" maxOccurs="1" minOccurs="0"/>
-        <xsd:element type="xsd:string" name="revision" maxOccurs="1" minOccurs="0">
-          <xsd:annotation>
-            <xsd:documentation>
-                        This value indicates the number of saves or revisions. The application is responsible for updating this value after each revision.
-                    </xsd:documentation>
-          </xsd:annotation>
-        </xsd:element>
-        <xsd:element type="xsd:string" name="lastModifiedBy" maxOccurs="1" minOccurs="0"/>
-        <xsd:element ref="dcterms:modified" maxOccurs="1" minOccurs="0"/>
-        <xsd:element type="xsd:dateTime" name="lastPrinted" maxOccurs="1" minOccurs="0"/>
-        <xsd:element type="xsd:string" name="contentStatus" maxOccurs="1" minOccurs="0"/>
-      </xsd:all>
-    </xsd:complexType>
-  </xsd:schema>
-</ct:contentTypeSchema>
+<p:properties xmlns:xsi="http://www.w3.org/2001/XMLSchema-instance" xmlns:p="http://schemas.microsoft.com/office/2006/metadata/properties" xmlns:pc="http://schemas.microsoft.com/office/infopath/2007/PartnerControls">
+  <documentManagement>
+    <PublishingExpirationDate xmlns="http://schemas.microsoft.com/sharepoint/v3" xsi:nil="true"/>
+    <PublishingStartDate xmlns="http://schemas.microsoft.com/sharepoint/v3" xsi:nil="true"/>
+  </documentManagement>
+</p:properties>
 </file>
 
 <file path=customXml/itemProps1.xml><?xml version="1.0" encoding="utf-8"?>
-<ds:datastoreItem xmlns:ds="http://schemas.openxmlformats.org/officeDocument/2006/customXml" ds:itemID="{FA8F0064-303C-446D-896E-46EEB9A79DC3}">
+<ds:datastoreItem xmlns:ds="http://schemas.openxmlformats.org/officeDocument/2006/customXml" ds:itemID="{B9A87442-5A7B-46FD-BD28-170CE9B7256F}">
   <ds:schemaRefs/>
 </ds:datastoreItem>
 </file>
@@ -2066,7 +2181,7 @@
 </file>
 
 <file path=customXml/itemProps3.xml><?xml version="1.0" encoding="utf-8"?>
-<ds:datastoreItem xmlns:ds="http://schemas.openxmlformats.org/officeDocument/2006/customXml" ds:itemID="{B9A87442-5A7B-46FD-BD28-170CE9B7256F}">
+<ds:datastoreItem xmlns:ds="http://schemas.openxmlformats.org/officeDocument/2006/customXml" ds:itemID="{FA8F0064-303C-446D-896E-46EEB9A79DC3}">
   <ds:schemaRefs/>
 </ds:datastoreItem>
 </file>
</xml_diff>